<commit_message>
Naamgeving complexiteitsmodel: werkdefinitie lectoraat i.p.v. Kim Meijer
Co-authored-by: Cursor <cursoragent@cursor.com>
</commit_message>
<xml_diff>
--- a/public/downloads/werkbladen/MV_23/WB-MW01-HBO-HRM-EN_teacher-version.docx
+++ b/public/downloads/werkbladen/MV_23/WB-MW01-HBO-HRM-EN_teacher-version.docx
@@ -1069,21 +1069,6 @@
           <w:sz w:val="16"/>
           <w:szCs w:val="16"/>
         </w:rPr>
-        <w:t xml:space="preserve">Meijer, K. (2023). Impossible and inevitable: Reconstructing the critique of business ethics [Doctoral dissertation, Tilburg University]. Ridderprint.</w:t>
-      </w:r>
-    </w:p>
-    <w:p>
-      <w:pPr>
-        <w:spacing w:after="40" w:line="240"/>
-        <w:ind w:left="360" w:hanging="360"/>
-      </w:pPr>
-      <w:r>
-        <w:rPr>
-          <w:rFonts w:ascii="Arial" w:cs="Arial" w:eastAsia="Arial" w:hAnsi="Arial"/>
-          <w:color w:val="333333"/>
-          <w:sz w:val="16"/>
-          <w:szCs w:val="16"/>
-        </w:rPr>
         <w:t xml:space="preserve">Heckmann, G. (1981). Das sokratische Gespräch: Erfahrungen in philosophischen Hochschulseminaren [The Socratic dialogue: Experiences in philosophical university seminars]. Schroedel.</w:t>
       </w:r>
     </w:p>
@@ -1115,7 +1100,7 @@
           <w:sz w:val="15"/>
           <w:szCs w:val="15"/>
         </w:rPr>
-        <w:t xml:space="preserve">Complexity determined using the research group’s working definition, based on the micro-meso-macro thinking of Meijer (2023).</w:t>
+        <w:t xml:space="preserve">Complexity determined using the research group’s working definition, based on the micro-meso-macro thinking of .</w:t>
       </w:r>
     </w:p>
     <w:sectPr>

</xml_diff>

<commit_message>
Driedeling: literatuur Meijer (2023), audit-scripts, archief oud script.
Co-authored-by: Cursor <cursoragent@cursor.com>
</commit_message>
<xml_diff>
--- a/public/downloads/werkbladen/MV_23/WB-MW01-HBO-HRM-EN_teacher-version.docx
+++ b/public/downloads/werkbladen/MV_23/WB-MW01-HBO-HRM-EN_teacher-version.docx
@@ -1088,6 +1088,16 @@
       </w:r>
     </w:p>
     <w:p>
+      <w:pPr/>
+      <w:r/>
+      <w:r>
+        <w:rPr>
+          <w:i/>
+        </w:rPr>
+        <w:t>Meijer, K. (2023). Impossible and inevitable: Reconstructing the critique of business ethics [Doctoral dissertation, Tilburg University]. Ridderprint BV.</w:t>
+      </w:r>
+    </w:p>
+    <w:p>
       <w:pPr>
         <w:spacing w:after="0" w:before="40"/>
       </w:pPr>

</xml_diff>